<commit_message>
feat: add assignments 2, 3, 4 and update 1
- Update assignment 1 answer sheet and rename submission PDF

- Add assignment 2 log analysis documents, checklist, and tutorial data

- Add assignment 3 reports and submissions

- Add assignment 4 encryption solutions, scripts, keys, and benchmarks
</commit_message>
<xml_diff>
--- a/ass1/answer_sheet.docx
+++ b/ass1/answer_sheet.docx
@@ -1,6 +1,6 @@
 
 <file path=word/document.xml><?xml version="1.0" encoding="utf-8"?>
-<w:document xmlns:wpc="http://schemas.microsoft.com/office/word/2010/wordprocessingCanvas" xmlns:cx="http://schemas.microsoft.com/office/drawing/2014/chartex" xmlns:cx1="http://schemas.microsoft.com/office/drawing/2015/9/8/chartex" xmlns:cx2="http://schemas.microsoft.com/office/drawing/2015/10/21/chartex" xmlns:cx3="http://schemas.microsoft.com/office/drawing/2016/5/9/chartex" xmlns:cx4="http://schemas.microsoft.com/office/drawing/2016/5/10/chartex" xmlns:cx5="http://schemas.microsoft.com/office/drawing/2016/5/11/chartex" xmlns:cx6="http://schemas.microsoft.com/office/drawing/2016/5/12/chartex" xmlns:cx7="http://schemas.microsoft.com/office/drawing/2016/5/13/chartex" xmlns:cx8="http://schemas.microsoft.com/office/drawing/2016/5/14/chartex" xmlns:mc="http://schemas.openxmlformats.org/markup-compatibility/2006" xmlns:aink="http://schemas.microsoft.com/office/drawing/2016/ink" xmlns:am3d="http://schemas.microsoft.com/office/drawing/2017/model3d" xmlns:o="urn:schemas-microsoft-com:office:office" xmlns:oel="http://schemas.microsoft.com/office/2019/extlst" xmlns:r="http://schemas.openxmlformats.org/officeDocument/2006/relationships" xmlns:m="http://schemas.openxmlformats.org/officeDocument/2006/math" xmlns:v="urn:schemas-microsoft-com:vml" xmlns:wp14="http://schemas.microsoft.com/office/word/2010/wordprocessingDrawing" xmlns:wp="http://schemas.openxmlformats.org/drawingml/2006/wordprocessingDrawing" xmlns:w10="urn:schemas-microsoft-com:office:word" xmlns:w="http://schemas.openxmlformats.org/wordprocessingml/2006/main" xmlns:w14="http://schemas.microsoft.com/office/word/2010/wordml" xmlns:w15="http://schemas.microsoft.com/office/word/2012/wordml" xmlns:w16cei="http://schemas.microsoft.com/office/word/2026/wordml/cei" xmlns:w16cex="http://schemas.microsoft.com/office/word/2018/wordml/cex" xmlns:w16cid="http://schemas.microsoft.com/office/word/2016/wordml/cid" xmlns:w16="http://schemas.microsoft.com/office/word/2018/wordml" xmlns:w16du="http://schemas.microsoft.com/office/word/2023/wordml/word16du" xmlns:w16sdtdh="http://schemas.microsoft.com/office/word/2020/wordml/sdtdatahash" xmlns:w16sdtfl="http://schemas.microsoft.com/office/word/2024/wordml/sdtformatlock" xmlns:w16se="http://schemas.microsoft.com/office/word/2015/wordml/symex" xmlns:wpg="http://schemas.microsoft.com/office/word/2010/wordprocessingGroup" xmlns:wpi="http://schemas.microsoft.com/office/word/2010/wordprocessingInk" xmlns:wne="http://schemas.microsoft.com/office/word/2006/wordml" xmlns:wps="http://schemas.microsoft.com/office/word/2010/wordprocessingShape" mc:Ignorable="w14 w15 w16se w16cid w16 w16cex w16sdtdh w16sdtfl w16du wp14">
+<w:document xmlns:wpc="http://schemas.microsoft.com/office/word/2010/wordprocessingCanvas" xmlns:cx="http://schemas.microsoft.com/office/drawing/2014/chartex" xmlns:cx1="http://schemas.microsoft.com/office/drawing/2015/9/8/chartex" xmlns:cx2="http://schemas.microsoft.com/office/drawing/2015/10/21/chartex" xmlns:cx3="http://schemas.microsoft.com/office/drawing/2016/5/9/chartex" xmlns:cx4="http://schemas.microsoft.com/office/drawing/2016/5/10/chartex" xmlns:cx5="http://schemas.microsoft.com/office/drawing/2016/5/11/chartex" xmlns:cx6="http://schemas.microsoft.com/office/drawing/2016/5/12/chartex" xmlns:cx7="http://schemas.microsoft.com/office/drawing/2016/5/13/chartex" xmlns:cx8="http://schemas.microsoft.com/office/drawing/2016/5/14/chartex" xmlns:mc="http://schemas.openxmlformats.org/markup-compatibility/2006" xmlns:aink="http://schemas.microsoft.com/office/drawing/2016/ink" xmlns:am3d="http://schemas.microsoft.com/office/drawing/2017/model3d" xmlns:o="urn:schemas-microsoft-com:office:office" xmlns:oel="http://schemas.microsoft.com/office/2019/extlst" xmlns:r="http://schemas.openxmlformats.org/officeDocument/2006/relationships" xmlns:m="http://schemas.openxmlformats.org/officeDocument/2006/math" xmlns:v="urn:schemas-microsoft-com:vml" xmlns:wp14="http://schemas.microsoft.com/office/word/2010/wordprocessingDrawing" xmlns:wp="http://schemas.openxmlformats.org/drawingml/2006/wordprocessingDrawing" xmlns:w10="urn:schemas-microsoft-com:office:word" xmlns:w="http://schemas.openxmlformats.org/wordprocessingml/2006/main" xmlns:w14="http://schemas.microsoft.com/office/word/2010/wordml" xmlns:w15="http://schemas.microsoft.com/office/word/2012/wordml" xmlns:w16cex="http://schemas.microsoft.com/office/word/2018/wordml/cex" xmlns:w16cid="http://schemas.microsoft.com/office/word/2016/wordml/cid" xmlns:w16="http://schemas.microsoft.com/office/word/2018/wordml" xmlns:w16du="http://schemas.microsoft.com/office/word/2023/wordml/word16du" xmlns:w16sdtdh="http://schemas.microsoft.com/office/word/2020/wordml/sdtdatahash" xmlns:w16sdtfl="http://schemas.microsoft.com/office/word/2024/wordml/sdtformatlock" xmlns:w16se="http://schemas.microsoft.com/office/word/2015/wordml/symex" xmlns:wpg="http://schemas.microsoft.com/office/word/2010/wordprocessingGroup" xmlns:wpi="http://schemas.microsoft.com/office/word/2010/wordprocessingInk" xmlns:wne="http://schemas.microsoft.com/office/word/2006/wordml" xmlns:wps="http://schemas.microsoft.com/office/word/2010/wordprocessingShape" mc:Ignorable="w14 w15 w16se w16cid w16 w16cex w16sdtdh w16sdtfl w16du wp14">
   <w:body>
     <w:p>
       <w:r>
@@ -225,10 +225,112 @@
     </w:p>
     <w:p>
       <w:pPr>
-        <w:jc w:val="center"/>
+        <w:rPr>
+          <w:rFonts w:hint="cs"/>
+          <w:cs/>
+        </w:rPr>
       </w:pPr>
+      <w:r>
+        <w:rPr>
+          <w:rFonts w:hint="cs"/>
+          <w:cs/>
+        </w:rPr>
+        <w:t>จะเห็นว่า</w:t>
+      </w:r>
+      <w:r>
+        <w:t xml:space="preserve"> bcrypt </w:t>
+      </w:r>
+      <w:r>
+        <w:rPr>
+          <w:rFonts w:hint="cs"/>
+          <w:cs/>
+        </w:rPr>
+        <w:t xml:space="preserve">ใช้เวลานานกว่า </w:t>
+      </w:r>
+      <w:r>
+        <w:t xml:space="preserve">sha1 </w:t>
+      </w:r>
+      <w:r>
+        <w:rPr>
+          <w:rFonts w:hint="cs"/>
+          <w:cs/>
+        </w:rPr>
+        <w:t xml:space="preserve">และ </w:t>
+      </w:r>
+      <w:r>
+        <w:t xml:space="preserve">md5 </w:t>
+      </w:r>
+      <w:r>
+        <w:rPr>
+          <w:rFonts w:hint="cs"/>
+          <w:cs/>
+        </w:rPr>
+        <w:t xml:space="preserve">เป็น </w:t>
+      </w:r>
+      <w:r>
+        <w:t xml:space="preserve">23908 </w:t>
+      </w:r>
+      <w:r>
+        <w:rPr>
+          <w:rFonts w:hint="cs"/>
+          <w:cs/>
+        </w:rPr>
+        <w:t xml:space="preserve">เท่าและ </w:t>
+      </w:r>
+      <w:r>
+        <w:t xml:space="preserve">63755 </w:t>
+      </w:r>
+      <w:r>
+        <w:rPr>
+          <w:rFonts w:hint="cs"/>
+          <w:cs/>
+        </w:rPr>
+        <w:t>เท่าซึ่งใช้การหลักการ</w:t>
+      </w:r>
+      <w:r>
+        <w:rPr>
+          <w:rFonts w:hint="cs"/>
+          <w:cs/>
+        </w:rPr>
+        <w:t>ทาง</w:t>
+      </w:r>
+      <w:r>
+        <w:t xml:space="preserve"> data sci </w:t>
+      </w:r>
+      <w:r>
+        <w:rPr>
+          <w:rFonts w:hint="cs"/>
+          <w:cs/>
+        </w:rPr>
+        <w:t xml:space="preserve">โดยตัด </w:t>
+      </w:r>
+      <w:r>
+        <w:t xml:space="preserve">outlier </w:t>
+      </w:r>
+      <w:r>
+        <w:rPr>
+          <w:rFonts w:hint="cs"/>
+          <w:cs/>
+        </w:rPr>
+        <w:t xml:space="preserve">และ คิด </w:t>
+      </w:r>
+      <w:r>
+        <w:t xml:space="preserve">trimmed mean </w:t>
+      </w:r>
+      <w:r>
+        <w:rPr>
+          <w:rFonts w:hint="cs"/>
+          <w:cs/>
+        </w:rPr>
+        <w:t>ออกมาเป็นเวลาเฉลี่ย</w:t>
+      </w:r>
     </w:p>
     <w:p>
+      <w:pPr>
+        <w:rPr>
+          <w:rFonts w:hint="cs"/>
+        </w:rPr>
+      </w:pPr>
       <w:r>
         <w:t xml:space="preserve">3. </w:t>
       </w:r>
@@ -444,19 +546,7 @@
           <w:rPr>
             <w:rFonts w:ascii="Cambria Math" w:hAnsi="Cambria Math"/>
           </w:rPr>
-          <m:t xml:space="preserve"> * C  </m:t>
-        </m:r>
-        <m:r>
-          <w:rPr>
-            <w:rFonts w:ascii="Cambria Math" w:hAnsi="Cambria Math"/>
-          </w:rPr>
-          <m:t>/</m:t>
-        </m:r>
-        <m:r>
-          <w:rPr>
-            <w:rFonts w:ascii="Cambria Math" w:hAnsi="Cambria Math"/>
-          </w:rPr>
-          <m:t xml:space="preserve"> 2&gt;= 31536000</m:t>
+          <m:t xml:space="preserve"> * C  / 2&gt;= 31536000</m:t>
         </m:r>
         <m:r>
           <m:rPr>
@@ -506,15 +596,7 @@
         <w:t>คือ ค่าเฉลี่ยของเวลาในการ</w:t>
       </w:r>
       <w:r>
-        <w:t xml:space="preserve"> </w:t>
-      </w:r>
-      <w:proofErr w:type="spellStart"/>
-      <w:r>
-        <w:t>hsah</w:t>
-      </w:r>
-      <w:proofErr w:type="spellEnd"/>
-      <w:r>
-        <w:t xml:space="preserve"> password 1 </w:t>
+        <w:t xml:space="preserve"> hsah password 1 </w:t>
       </w:r>
       <w:r>
         <w:rPr>
@@ -585,12 +667,6 @@
           <w:cs/>
         </w:rPr>
         <w:t xml:space="preserve"> เลย</w:t>
-      </w:r>
-      <w:r>
-        <w:rPr>
-          <w:cs/>
-        </w:rPr>
-        <w:br/>
       </w:r>
       <w:r>
         <w:rPr>
@@ -638,19 +714,7 @@
           <w:rPr>
             <w:rFonts w:ascii="Cambria Math" w:hAnsi="Cambria Math"/>
           </w:rPr>
-          <m:t xml:space="preserve"> * 0.000016 </m:t>
-        </m:r>
-        <m:r>
-          <w:rPr>
-            <w:rFonts w:ascii="Cambria Math" w:hAnsi="Cambria Math"/>
-          </w:rPr>
-          <m:t>/</m:t>
-        </m:r>
-        <m:r>
-          <w:rPr>
-            <w:rFonts w:ascii="Cambria Math" w:hAnsi="Cambria Math"/>
-          </w:rPr>
-          <m:t xml:space="preserve"> 2&gt;= 31536000</m:t>
+          <m:t xml:space="preserve"> * 0.000016 / 2&gt;= 31536000</m:t>
         </m:r>
       </m:oMath>
       <w:r>
@@ -734,19 +798,7 @@
           <w:rPr>
             <w:rFonts w:ascii="Cambria Math" w:hAnsi="Cambria Math"/>
           </w:rPr>
-          <m:t xml:space="preserve"> * 0.000006 </m:t>
-        </m:r>
-        <m:r>
-          <w:rPr>
-            <w:rFonts w:ascii="Cambria Math" w:hAnsi="Cambria Math"/>
-          </w:rPr>
-          <m:t>/</m:t>
-        </m:r>
-        <m:r>
-          <w:rPr>
-            <w:rFonts w:ascii="Cambria Math" w:hAnsi="Cambria Math"/>
-          </w:rPr>
-          <m:t xml:space="preserve"> 2&gt;= 31536000</m:t>
+          <m:t xml:space="preserve"> * 0.000006 / 2&gt;= 31536000</m:t>
         </m:r>
       </m:oMath>
       <w:r>
@@ -795,15 +847,7 @@
         <w:t>สำหรับ</w:t>
       </w:r>
       <w:r>
-        <w:t xml:space="preserve"> </w:t>
-      </w:r>
-      <w:proofErr w:type="spellStart"/>
-      <w:r>
-        <w:t>bcrypt</w:t>
-      </w:r>
-      <w:proofErr w:type="spellEnd"/>
-      <w:r>
-        <w:t xml:space="preserve">: </w:t>
+        <w:t xml:space="preserve"> bcrypt: </w:t>
       </w:r>
       <m:oMath>
         <m:sSup>
@@ -835,19 +879,7 @@
           <w:rPr>
             <w:rFonts w:ascii="Cambria Math" w:hAnsi="Cambria Math"/>
           </w:rPr>
-          <m:t xml:space="preserve"> * 0.382539 </m:t>
-        </m:r>
-        <m:r>
-          <w:rPr>
-            <w:rFonts w:ascii="Cambria Math" w:hAnsi="Cambria Math"/>
-          </w:rPr>
-          <m:t>/</m:t>
-        </m:r>
-        <m:r>
-          <w:rPr>
-            <w:rFonts w:ascii="Cambria Math" w:hAnsi="Cambria Math"/>
-          </w:rPr>
-          <m:t xml:space="preserve"> 2&gt;= 31536000</m:t>
+          <m:t xml:space="preserve"> * 0.382539 / 2&gt;= 31536000</m:t>
         </m:r>
       </m:oMath>
       <w:r>
@@ -872,276 +904,516 @@
           <w:cs/>
         </w:rPr>
         <w:t>ตัวอักษร</w:t>
+      </w:r>
+      <w:r>
+        <w:rPr>
+          <w:cs/>
+        </w:rPr>
+        <w:br/>
+      </w:r>
+    </w:p>
+    <w:p>
+      <w:pPr>
+        <w:rPr>
+          <w:rFonts w:hint="cs"/>
+          <w:cs/>
+        </w:rPr>
+      </w:pPr>
+      <w:r>
+        <w:t xml:space="preserve">4. </w:t>
+      </w:r>
+      <w:r>
+        <w:rPr>
+          <w:rFonts w:hint="cs"/>
+          <w:cs/>
+        </w:rPr>
+        <w:t>ตอบ เป็นไปได้</w:t>
+      </w:r>
+      <w:r>
+        <w:rPr>
+          <w:rFonts w:hint="cs"/>
+          <w:cs/>
+        </w:rPr>
+        <w:t>แต่ไม่</w:t>
+      </w:r>
+      <w:r>
+        <w:t xml:space="preserve"> practical </w:t>
+      </w:r>
+      <w:r>
+        <w:rPr>
+          <w:rFonts w:hint="cs"/>
+          <w:cs/>
+        </w:rPr>
+        <w:t xml:space="preserve">เพราะ </w:t>
+      </w:r>
+      <w:r>
+        <w:t xml:space="preserve">bcrypt algorithm </w:t>
+      </w:r>
+      <w:r>
+        <w:rPr>
+          <w:rFonts w:hint="cs"/>
+          <w:cs/>
+        </w:rPr>
+        <w:t>มีการกำหนดคุณลักษณะของ</w:t>
+      </w:r>
+      <w:r>
+        <w:t xml:space="preserve"> password </w:t>
+      </w:r>
+      <w:r>
+        <w:rPr>
+          <w:rFonts w:hint="cs"/>
+          <w:cs/>
+        </w:rPr>
+        <w:t>ไว้ชัดเจนทำให้เราสามารถรูั</w:t>
+      </w:r>
+      <w:r>
+        <w:t xml:space="preserve"> salt </w:t>
+      </w:r>
+      <w:r>
+        <w:rPr>
+          <w:rFonts w:hint="cs"/>
+          <w:cs/>
+        </w:rPr>
+        <w:t xml:space="preserve">ที่เขาเติมได้จาก </w:t>
+      </w:r>
+      <w:r>
+        <w:t xml:space="preserve">hash </w:t>
+      </w:r>
+      <w:r>
+        <w:rPr>
+          <w:rFonts w:hint="cs"/>
+          <w:cs/>
+        </w:rPr>
+        <w:t>ที่ได้มาจากนั้นพอรู้</w:t>
+      </w:r>
+      <w:r>
+        <w:t xml:space="preserve"> hash </w:t>
+      </w:r>
+      <w:r>
+        <w:rPr>
+          <w:rFonts w:hint="cs"/>
+          <w:cs/>
+        </w:rPr>
+        <w:t xml:space="preserve">ก็ทำเพียงแค่ </w:t>
+      </w:r>
+      <w:r>
+        <w:t xml:space="preserve">brute force </w:t>
+      </w:r>
+      <w:r>
+        <w:rPr>
+          <w:rFonts w:hint="cs"/>
+          <w:cs/>
+        </w:rPr>
+        <w:t>ในส่วนของ</w:t>
+      </w:r>
+      <w:r>
+        <w:t xml:space="preserve"> password plain text </w:t>
+      </w:r>
+      <w:r>
+        <w:rPr>
+          <w:rFonts w:hint="cs"/>
+          <w:cs/>
+        </w:rPr>
+        <w:t>จริงๆแล้วเอา</w:t>
+      </w:r>
+      <w:r>
+        <w:t xml:space="preserve"> salt </w:t>
+      </w:r>
+      <w:r>
+        <w:rPr>
+          <w:rFonts w:hint="cs"/>
+          <w:cs/>
+        </w:rPr>
+        <w:t xml:space="preserve">ทื่ได้จาก </w:t>
+      </w:r>
+      <w:r>
+        <w:t xml:space="preserve">hash database </w:t>
+      </w:r>
+      <w:r>
+        <w:rPr>
+          <w:rFonts w:hint="cs"/>
+          <w:cs/>
+        </w:rPr>
+        <w:t>มาเติมเพื่อทำ</w:t>
+      </w:r>
+      <w:r>
+        <w:t xml:space="preserve"> brute force </w:t>
+      </w:r>
+      <w:r>
+        <w:rPr>
+          <w:rFonts w:hint="cs"/>
+          <w:cs/>
+        </w:rPr>
+        <w:t>เช็คต่อไป</w:t>
+      </w:r>
+      <w:r>
+        <w:t xml:space="preserve"> </w:t>
+      </w:r>
+      <w:r>
+        <w:rPr>
+          <w:rFonts w:hint="cs"/>
+          <w:cs/>
+        </w:rPr>
+        <w:t>แต่ถึงกระนั้น</w:t>
+      </w:r>
+      <w:r>
+        <w:t xml:space="preserve">  bcrypt </w:t>
+      </w:r>
+      <w:r>
+        <w:rPr>
+          <w:rFonts w:hint="cs"/>
+          <w:cs/>
+        </w:rPr>
+        <w:t>ก็ยังมีการหน่วงเวลาด้วย</w:t>
+      </w:r>
+      <w:r>
+        <w:t xml:space="preserve"> cost factor </w:t>
+      </w:r>
+      <w:r>
+        <w:rPr>
+          <w:rFonts w:hint="cs"/>
+          <w:cs/>
+        </w:rPr>
+        <w:t>ทำให้การ</w:t>
+      </w:r>
+      <w:r>
+        <w:t xml:space="preserve"> hash password </w:t>
+      </w:r>
+      <w:r>
+        <w:rPr>
+          <w:rFonts w:hint="cs"/>
+          <w:cs/>
+        </w:rPr>
+        <w:t xml:space="preserve">จะใช้เวลามากกว่า </w:t>
+      </w:r>
+      <w:r>
+        <w:t xml:space="preserve">md5 </w:t>
+      </w:r>
+      <w:r>
+        <w:rPr>
+          <w:rFonts w:hint="cs"/>
+          <w:cs/>
+        </w:rPr>
+        <w:t>หรือ</w:t>
+      </w:r>
+      <w:r>
+        <w:t xml:space="preserve"> sha1 </w:t>
+      </w:r>
+      <w:r>
+        <w:rPr>
+          <w:rFonts w:hint="cs"/>
+          <w:cs/>
+        </w:rPr>
+        <w:t>มหาศาลทำให้ไม่มีประสิทธิภาพ</w:t>
+      </w:r>
+    </w:p>
+    <w:p>
+      <w:pPr>
+        <w:rPr>
+          <w:rFonts w:hint="cs"/>
+          <w:cs/>
+        </w:rPr>
+      </w:pPr>
+      <w:r>
+        <w:lastRenderedPageBreak/>
+        <w:t xml:space="preserve">5. </w:t>
+      </w:r>
+      <w:r>
+        <w:rPr>
+          <w:rFonts w:hint="cs"/>
+          <w:cs/>
+        </w:rPr>
+        <w:t>ตอบ</w:t>
+      </w:r>
+      <w:r>
+        <w:t xml:space="preserve"> </w:t>
+      </w:r>
+      <w:r>
+        <w:rPr>
+          <w:rFonts w:hint="cs"/>
+          <w:cs/>
+        </w:rPr>
+        <w:t>ไม่ได้</w:t>
+      </w:r>
+      <w:r>
+        <w:rPr>
+          <w:rFonts w:hint="cs"/>
+          <w:cs/>
+        </w:rPr>
+        <w:t>และไม่</w:t>
+      </w:r>
+      <w:r>
+        <w:t xml:space="preserve"> practical</w:t>
+      </w:r>
+      <w:r>
+        <w:rPr>
+          <w:rFonts w:hint="cs"/>
+          <w:cs/>
+        </w:rPr>
+        <w:t xml:space="preserve">เพราะ </w:t>
+      </w:r>
+      <w:r>
+        <w:t xml:space="preserve">bcrypt </w:t>
+      </w:r>
+      <w:r>
+        <w:rPr>
+          <w:rFonts w:hint="cs"/>
+          <w:cs/>
+        </w:rPr>
+        <w:t>ถูก</w:t>
+      </w:r>
+      <w:r>
+        <w:t xml:space="preserve"> design </w:t>
+      </w:r>
+      <w:r>
+        <w:rPr>
+          <w:rFonts w:hint="cs"/>
+          <w:cs/>
+        </w:rPr>
+        <w:t>ให้เติม</w:t>
+      </w:r>
+      <w:r>
+        <w:t xml:space="preserve"> salt </w:t>
+      </w:r>
+      <w:r>
+        <w:rPr>
+          <w:rFonts w:hint="cs"/>
+          <w:cs/>
+        </w:rPr>
+        <w:t xml:space="preserve">ที่มี </w:t>
+      </w:r>
+      <w:r>
+        <w:t xml:space="preserve">characteristic </w:t>
+      </w:r>
+      <w:r>
+        <w:rPr>
+          <w:rFonts w:hint="cs"/>
+          <w:cs/>
+        </w:rPr>
+        <w:t>เฉพาะทำให้การ</w:t>
+      </w:r>
+      <w:r>
+        <w:t xml:space="preserve"> precompute password </w:t>
+      </w:r>
+      <w:r>
+        <w:rPr>
+          <w:rFonts w:hint="cs"/>
+          <w:cs/>
+        </w:rPr>
+        <w:t>อื่นๆมาก่อนไม่สามารถรู้</w:t>
+      </w:r>
+      <w:r>
+        <w:t xml:space="preserve"> salt </w:t>
+      </w:r>
+      <w:r>
+        <w:rPr>
+          <w:rFonts w:hint="cs"/>
+          <w:cs/>
+        </w:rPr>
+        <w:t xml:space="preserve">ได้ทำให้แม้จะ </w:t>
+      </w:r>
+      <w:r>
+        <w:t xml:space="preserve">hash </w:t>
+      </w:r>
+      <w:r>
+        <w:rPr>
+          <w:rFonts w:hint="cs"/>
+          <w:cs/>
+        </w:rPr>
+        <w:t xml:space="preserve">ได้ค่าออกมาก็จะไม่ตรงเพราะ </w:t>
+      </w:r>
+      <w:r>
+        <w:t xml:space="preserve">salt </w:t>
+      </w:r>
+      <w:r>
+        <w:rPr>
+          <w:rFonts w:hint="cs"/>
+          <w:cs/>
+        </w:rPr>
+        <w:t>ที่เติมไม่ตรงกัน</w:t>
+      </w:r>
+      <w:r>
+        <w:t xml:space="preserve"> </w:t>
+      </w:r>
+      <w:r>
+        <w:rPr>
+          <w:rFonts w:hint="cs"/>
+          <w:cs/>
+        </w:rPr>
+        <w:t>ทำให้เป็นไปไม่ได้เลยแม้แต่การจะสร้างทุกความเป็นไปได้ของการ</w:t>
+      </w:r>
+      <w:r>
+        <w:t xml:space="preserve"> generate password </w:t>
+      </w:r>
+      <w:r>
+        <w:rPr>
+          <w:rFonts w:hint="cs"/>
+          <w:cs/>
+        </w:rPr>
+        <w:t>พร้อมกับการ</w:t>
+      </w:r>
+      <w:r>
+        <w:t xml:space="preserve"> generate salt </w:t>
+      </w:r>
+      <w:r>
+        <w:rPr>
+          <w:rFonts w:hint="cs"/>
+          <w:cs/>
+        </w:rPr>
+        <w:t>แล้วเก็บลง</w:t>
+      </w:r>
+      <w:r>
+        <w:t xml:space="preserve"> table </w:t>
+      </w:r>
+      <w:r>
+        <w:rPr>
+          <w:rFonts w:hint="cs"/>
+          <w:cs/>
+        </w:rPr>
+        <w:t>ยิ่งเป็นไปไม่ได้และไม่มีประสิทธิภาพมหาศาล</w:t>
       </w:r>
     </w:p>
     <w:p/>
     <w:p>
       <w:r>
-        <w:t xml:space="preserve">4. </w:t>
-      </w:r>
-      <w:r>
-        <w:rPr>
-          <w:rFonts w:hint="cs"/>
-          <w:cs/>
-        </w:rPr>
-        <w:t xml:space="preserve">ตอบ เป็นไปได้เพราะ </w:t>
-      </w:r>
-      <w:proofErr w:type="spellStart"/>
-      <w:r>
-        <w:t>bcrypt</w:t>
-      </w:r>
-      <w:proofErr w:type="spellEnd"/>
-      <w:r>
-        <w:t xml:space="preserve"> algorithm </w:t>
-      </w:r>
-      <w:r>
-        <w:rPr>
-          <w:rFonts w:hint="cs"/>
-          <w:cs/>
-        </w:rPr>
-        <w:t>มีการกำหนดคุณลักษณะของ</w:t>
-      </w:r>
-      <w:r>
-        <w:t xml:space="preserve"> password </w:t>
-      </w:r>
-      <w:r>
-        <w:rPr>
-          <w:rFonts w:hint="cs"/>
-          <w:cs/>
-        </w:rPr>
-        <w:t>ไว้ชัดเจนทำให้เราสามารถรูั</w:t>
-      </w:r>
-      <w:r>
-        <w:t xml:space="preserve"> salt </w:t>
-      </w:r>
-      <w:r>
-        <w:rPr>
-          <w:rFonts w:hint="cs"/>
-          <w:cs/>
-        </w:rPr>
-        <w:t xml:space="preserve">ที่เขาเติมได้จาก </w:t>
+        <w:t xml:space="preserve">6. </w:t>
+      </w:r>
+      <w:r>
+        <w:rPr>
+          <w:rFonts w:hint="cs"/>
+          <w:cs/>
+        </w:rPr>
+        <w:t>ตอบ</w:t>
+      </w:r>
+      <w:r>
+        <w:rPr>
+          <w:rFonts w:hint="cs"/>
+          <w:cs/>
+        </w:rPr>
+        <w:t xml:space="preserve"> </w:t>
+      </w:r>
+      <w:r>
+        <w:rPr>
+          <w:cs/>
+        </w:rPr>
+        <w:t xml:space="preserve">ใช้หลักการของ </w:t>
+      </w:r>
+      <w:r>
+        <w:t xml:space="preserve">3A + 2I </w:t>
+      </w:r>
+      <w:r>
+        <w:rPr>
+          <w:cs/>
+        </w:rPr>
+        <w:t xml:space="preserve">ได้มั้ยโดยที่ผมจะให้ตัว โดยนำ </w:t>
+      </w:r>
+      <w:r>
+        <w:t xml:space="preserve">Authentication </w:t>
+      </w:r>
+      <w:r>
+        <w:rPr>
+          <w:cs/>
+        </w:rPr>
+        <w:t xml:space="preserve">มาระบุว่า </w:t>
+      </w:r>
+      <w:r>
+        <w:t xml:space="preserve">user </w:t>
+      </w:r>
+      <w:r>
+        <w:rPr>
+          <w:cs/>
+        </w:rPr>
+        <w:t xml:space="preserve">ที่ส่ง </w:t>
+      </w:r>
+      <w:r>
+        <w:t xml:space="preserve">request access </w:t>
+      </w:r>
+      <w:r>
+        <w:rPr>
+          <w:cs/>
+        </w:rPr>
+        <w:t xml:space="preserve">ข้อมูลมานั้นเป็นใครผ่าน </w:t>
+      </w:r>
+      <w:r>
+        <w:t xml:space="preserve">credential </w:t>
+      </w:r>
+      <w:r>
+        <w:rPr>
+          <w:cs/>
+        </w:rPr>
+        <w:t xml:space="preserve">ที่เขามี จากนั้น </w:t>
+      </w:r>
+      <w:r>
+        <w:t xml:space="preserve">Authority </w:t>
+      </w:r>
+      <w:r>
+        <w:rPr>
+          <w:cs/>
+        </w:rPr>
+        <w:t xml:space="preserve">ว่า </w:t>
+      </w:r>
+      <w:r>
+        <w:t xml:space="preserve">User </w:t>
+      </w:r>
+      <w:r>
+        <w:rPr>
+          <w:cs/>
+        </w:rPr>
+        <w:t xml:space="preserve">คนนั้นสามารถทำอะไรได้บ้างเช่นอ่านข้อมูลของตัวเองได้อย่างเดียว โดยที่ผมจะกำหนดว่าจะไม่มีการ </w:t>
+      </w:r>
+      <w:r>
+        <w:t xml:space="preserve">return password </w:t>
+      </w:r>
+      <w:r>
+        <w:rPr>
+          <w:cs/>
+        </w:rPr>
+        <w:t xml:space="preserve">ที่ </w:t>
       </w:r>
       <w:r>
         <w:t xml:space="preserve">hash </w:t>
       </w:r>
       <w:r>
         <w:rPr>
-          <w:rFonts w:hint="cs"/>
-          <w:cs/>
-        </w:rPr>
-        <w:t>ที่ได้มาจากนั้นพอรู้</w:t>
-      </w:r>
-      <w:r>
-        <w:t xml:space="preserve"> hash </w:t>
-      </w:r>
-      <w:r>
-        <w:rPr>
-          <w:rFonts w:hint="cs"/>
-          <w:cs/>
-        </w:rPr>
-        <w:t xml:space="preserve">ก็ทำเพียงแค่ </w:t>
-      </w:r>
-      <w:r>
-        <w:t xml:space="preserve">brute force </w:t>
-      </w:r>
-      <w:r>
-        <w:rPr>
-          <w:rFonts w:hint="cs"/>
-          <w:cs/>
-        </w:rPr>
-        <w:t>ในส่วนของ</w:t>
-      </w:r>
-      <w:r>
-        <w:t xml:space="preserve"> password plain text </w:t>
-      </w:r>
-      <w:r>
-        <w:rPr>
-          <w:rFonts w:hint="cs"/>
-          <w:cs/>
-        </w:rPr>
-        <w:t>จริงๆแล้วเอา</w:t>
-      </w:r>
-      <w:r>
-        <w:t xml:space="preserve"> salt </w:t>
-      </w:r>
-      <w:r>
-        <w:rPr>
-          <w:rFonts w:hint="cs"/>
-          <w:cs/>
-        </w:rPr>
-        <w:t xml:space="preserve">ทื่ได้จาก </w:t>
-      </w:r>
-      <w:r>
-        <w:t xml:space="preserve">hash database </w:t>
-      </w:r>
-      <w:r>
-        <w:rPr>
-          <w:rFonts w:hint="cs"/>
-          <w:cs/>
-        </w:rPr>
-        <w:t>มาเติมเพื่อทำ</w:t>
-      </w:r>
-      <w:r>
-        <w:t xml:space="preserve"> brute force </w:t>
-      </w:r>
-      <w:r>
-        <w:rPr>
-          <w:rFonts w:hint="cs"/>
-          <w:cs/>
-        </w:rPr>
-        <w:t>เช็คต่อไป</w:t>
-      </w:r>
-    </w:p>
-    <w:p>
-      <w:r>
-        <w:lastRenderedPageBreak/>
-        <w:t xml:space="preserve">5. </w:t>
-      </w:r>
-      <w:r>
-        <w:rPr>
-          <w:rFonts w:hint="cs"/>
-          <w:cs/>
-        </w:rPr>
-        <w:t>ตอบ</w:t>
-      </w:r>
-      <w:r>
-        <w:t xml:space="preserve"> </w:t>
-      </w:r>
-      <w:r>
-        <w:rPr>
-          <w:rFonts w:hint="cs"/>
-          <w:cs/>
-        </w:rPr>
-        <w:t xml:space="preserve">ไม่ได้เพราะ </w:t>
-      </w:r>
-      <w:proofErr w:type="spellStart"/>
-      <w:r>
-        <w:t>bcrypt</w:t>
-      </w:r>
-      <w:proofErr w:type="spellEnd"/>
-      <w:r>
-        <w:t xml:space="preserve"> </w:t>
-      </w:r>
-      <w:r>
-        <w:rPr>
-          <w:rFonts w:hint="cs"/>
-          <w:cs/>
-        </w:rPr>
-        <w:t>ถูก</w:t>
-      </w:r>
-      <w:r>
-        <w:t xml:space="preserve"> design </w:t>
-      </w:r>
-      <w:r>
-        <w:rPr>
-          <w:rFonts w:hint="cs"/>
-          <w:cs/>
-        </w:rPr>
-        <w:t>ให้เติม</w:t>
-      </w:r>
-      <w:r>
-        <w:t xml:space="preserve"> salt </w:t>
-      </w:r>
-      <w:r>
-        <w:rPr>
-          <w:rFonts w:hint="cs"/>
-          <w:cs/>
-        </w:rPr>
-        <w:t xml:space="preserve">ที่มี </w:t>
-      </w:r>
-      <w:r>
-        <w:t xml:space="preserve">characteristic </w:t>
-      </w:r>
-      <w:r>
-        <w:rPr>
-          <w:rFonts w:hint="cs"/>
-          <w:cs/>
-        </w:rPr>
-        <w:t>เฉพาะทำให้การ</w:t>
-      </w:r>
-      <w:r>
-        <w:t xml:space="preserve"> precompute password </w:t>
-      </w:r>
-      <w:r>
-        <w:rPr>
-          <w:rFonts w:hint="cs"/>
-          <w:cs/>
-        </w:rPr>
-        <w:t>อื่นๆมาก่อนไม่สามารถรู้</w:t>
-      </w:r>
-      <w:r>
-        <w:t xml:space="preserve"> salt </w:t>
-      </w:r>
-      <w:r>
-        <w:rPr>
-          <w:rFonts w:hint="cs"/>
-          <w:cs/>
-        </w:rPr>
-        <w:t xml:space="preserve">ได้ทำให้แม้จะ </w:t>
-      </w:r>
-      <w:r>
-        <w:t xml:space="preserve">hash </w:t>
-      </w:r>
-      <w:r>
-        <w:rPr>
-          <w:rFonts w:hint="cs"/>
-          <w:cs/>
-        </w:rPr>
-        <w:t xml:space="preserve">ได้ค่าออกมาก็จะไม่ตรงเพราะ </w:t>
-      </w:r>
-      <w:r>
-        <w:t xml:space="preserve">salt </w:t>
-      </w:r>
-      <w:r>
-        <w:rPr>
-          <w:rFonts w:hint="cs"/>
-          <w:cs/>
-        </w:rPr>
-        <w:t>ที่เติมไม่ตรงกัน</w:t>
-      </w:r>
-    </w:p>
-    <w:p/>
-    <w:p>
-      <w:r>
-        <w:t xml:space="preserve">6. </w:t>
-      </w:r>
-      <w:r>
-        <w:rPr>
-          <w:rFonts w:hint="cs"/>
-          <w:cs/>
-        </w:rPr>
-        <w:t>ตอบ</w:t>
-      </w:r>
-      <w:r>
-        <w:rPr>
-          <w:rFonts w:hint="cs"/>
-          <w:cs/>
-        </w:rPr>
-        <w:t xml:space="preserve"> </w:t>
-      </w:r>
-      <w:r>
-        <w:rPr>
-          <w:cs/>
-        </w:rPr>
-        <w:t xml:space="preserve">ใช้หลักการของ </w:t>
-      </w:r>
-      <w:r>
-        <w:t xml:space="preserve">3A + 2I </w:t>
-      </w:r>
-      <w:r>
-        <w:rPr>
-          <w:cs/>
-        </w:rPr>
-        <w:t xml:space="preserve">ได้มั้ยโดยที่ผมจะให้ตัว โดยนำ </w:t>
-      </w:r>
-      <w:r>
-        <w:t xml:space="preserve">Authentication </w:t>
-      </w:r>
-      <w:r>
-        <w:rPr>
-          <w:cs/>
-        </w:rPr>
-        <w:t xml:space="preserve">มาระบุว่า </w:t>
+          <w:cs/>
+        </w:rPr>
+        <w:t xml:space="preserve">กลับไปให้ผ่าน </w:t>
+      </w:r>
+      <w:r>
+        <w:t xml:space="preserve">request </w:t>
+      </w:r>
+      <w:r>
+        <w:rPr>
+          <w:cs/>
+        </w:rPr>
+        <w:t xml:space="preserve">นั้นเพื่อป้องกันการหลุดของ </w:t>
+      </w:r>
+      <w:r>
+        <w:t xml:space="preserve">password </w:t>
+      </w:r>
+      <w:r>
+        <w:rPr>
+          <w:cs/>
+        </w:rPr>
+        <w:t xml:space="preserve">จากนั้น </w:t>
+      </w:r>
+      <w:r>
+        <w:t xml:space="preserve">accounting </w:t>
+      </w:r>
+      <w:r>
+        <w:rPr>
+          <w:cs/>
+        </w:rPr>
+        <w:t xml:space="preserve">ทำการเก็บ </w:t>
+      </w:r>
+      <w:r>
+        <w:t xml:space="preserve">log </w:t>
+      </w:r>
+      <w:r>
+        <w:rPr>
+          <w:cs/>
+        </w:rPr>
+        <w:t xml:space="preserve">ว่ามี </w:t>
       </w:r>
       <w:r>
         <w:t xml:space="preserve">user </w:t>
@@ -1150,105 +1422,6 @@
         <w:rPr>
           <w:cs/>
         </w:rPr>
-        <w:t xml:space="preserve">ที่ส่ง </w:t>
-      </w:r>
-      <w:r>
-        <w:t xml:space="preserve">request access </w:t>
-      </w:r>
-      <w:r>
-        <w:rPr>
-          <w:cs/>
-        </w:rPr>
-        <w:t xml:space="preserve">ข้อมูลมานั้นเป็นใครผ่าน </w:t>
-      </w:r>
-      <w:r>
-        <w:t xml:space="preserve">credential </w:t>
-      </w:r>
-      <w:r>
-        <w:rPr>
-          <w:cs/>
-        </w:rPr>
-        <w:t xml:space="preserve">ที่เขามี จากนั้น </w:t>
-      </w:r>
-      <w:r>
-        <w:t xml:space="preserve">Authority </w:t>
-      </w:r>
-      <w:r>
-        <w:rPr>
-          <w:cs/>
-        </w:rPr>
-        <w:t xml:space="preserve">ว่า </w:t>
-      </w:r>
-      <w:r>
-        <w:t xml:space="preserve">User </w:t>
-      </w:r>
-      <w:r>
-        <w:rPr>
-          <w:cs/>
-        </w:rPr>
-        <w:t xml:space="preserve">คนนั้นสามารถทำอะไรได้บ้างเช่นอ่านข้อมูลของตัวเองได้อย่างเดียว โดยที่ผมจะกำหนดว่าจะไม่มีการ </w:t>
-      </w:r>
-      <w:r>
-        <w:t xml:space="preserve">return password </w:t>
-      </w:r>
-      <w:r>
-        <w:rPr>
-          <w:cs/>
-        </w:rPr>
-        <w:t xml:space="preserve">ที่ </w:t>
-      </w:r>
-      <w:r>
-        <w:t xml:space="preserve">hash </w:t>
-      </w:r>
-      <w:r>
-        <w:rPr>
-          <w:cs/>
-        </w:rPr>
-        <w:t xml:space="preserve">กลับไปให้ผ่าน </w:t>
-      </w:r>
-      <w:r>
-        <w:t xml:space="preserve">request </w:t>
-      </w:r>
-      <w:r>
-        <w:rPr>
-          <w:cs/>
-        </w:rPr>
-        <w:t xml:space="preserve">นั้นเพื่อป้องกันการหลุดของ </w:t>
-      </w:r>
-      <w:r>
-        <w:t xml:space="preserve">password </w:t>
-      </w:r>
-      <w:r>
-        <w:rPr>
-          <w:cs/>
-        </w:rPr>
-        <w:t xml:space="preserve">จากนั้น </w:t>
-      </w:r>
-      <w:r>
-        <w:t xml:space="preserve">accounting </w:t>
-      </w:r>
-      <w:r>
-        <w:rPr>
-          <w:cs/>
-        </w:rPr>
-        <w:t xml:space="preserve">ทำการเก็บ </w:t>
-      </w:r>
-      <w:r>
-        <w:t xml:space="preserve">log </w:t>
-      </w:r>
-      <w:r>
-        <w:rPr>
-          <w:cs/>
-        </w:rPr>
-        <w:t xml:space="preserve">ว่ามี </w:t>
-      </w:r>
-      <w:r>
-        <w:t xml:space="preserve">user </w:t>
-      </w:r>
-      <w:r>
-        <w:rPr>
-          <w:cs/>
-        </w:rPr>
         <w:t xml:space="preserve">คนนี้มาทำการขอ </w:t>
       </w:r>
       <w:r>
@@ -1357,13 +1530,8 @@
         </w:rPr>
         <w:t xml:space="preserve">ด้วย โดยการทำการป้องกัน </w:t>
       </w:r>
-      <w:proofErr w:type="spellStart"/>
-      <w:r>
-        <w:t>sql</w:t>
-      </w:r>
-      <w:proofErr w:type="spellEnd"/>
-      <w:r>
-        <w:t xml:space="preserve"> injection </w:t>
+      <w:r>
+        <w:t xml:space="preserve">sql injection </w:t>
       </w:r>
       <w:r>
         <w:rPr>
@@ -1403,169 +1571,172 @@
         </w:rPr>
         <w:t xml:space="preserve">ผมจะใช้ </w:t>
       </w:r>
-      <w:proofErr w:type="spellStart"/>
-      <w:r>
-        <w:t>bcrypt</w:t>
-      </w:r>
-      <w:proofErr w:type="spellEnd"/>
+      <w:r>
+        <w:t xml:space="preserve">bcrypt </w:t>
+      </w:r>
+      <w:r>
+        <w:rPr>
+          <w:cs/>
+        </w:rPr>
+        <w:t xml:space="preserve">ที่ </w:t>
+      </w:r>
+      <w:r>
+        <w:t xml:space="preserve">gen salt </w:t>
+      </w:r>
+      <w:r>
+        <w:rPr>
+          <w:cs/>
+        </w:rPr>
+        <w:t>ด้วยข้อมูล</w:t>
+      </w:r>
+      <w:r>
+        <w:t xml:space="preserve"> algorithm random </w:t>
+      </w:r>
+      <w:r>
+        <w:rPr>
+          <w:cs/>
+        </w:rPr>
+        <w:t xml:space="preserve">เป็นต้น เพื่อป้องกัน </w:t>
+      </w:r>
+      <w:r>
+        <w:t xml:space="preserve">rainbow attack </w:t>
+      </w:r>
+      <w:r>
+        <w:rPr>
+          <w:cs/>
+        </w:rPr>
+        <w:t xml:space="preserve">และ </w:t>
+      </w:r>
+      <w:r>
+        <w:t xml:space="preserve">schema </w:t>
+      </w:r>
+      <w:r>
+        <w:rPr>
+          <w:cs/>
+        </w:rPr>
+        <w:t xml:space="preserve">ของ </w:t>
+      </w:r>
+      <w:r>
+        <w:t xml:space="preserve">database </w:t>
+      </w:r>
+      <w:r>
+        <w:rPr>
+          <w:cs/>
+        </w:rPr>
+        <w:t xml:space="preserve">ก็ต้องกำหนดให้ </w:t>
+      </w:r>
+      <w:r>
+        <w:t xml:space="preserve">password </w:t>
+      </w:r>
+      <w:r>
+        <w:rPr>
+          <w:cs/>
+        </w:rPr>
+        <w:t xml:space="preserve">มีความยาวของ </w:t>
+      </w:r>
+      <w:r>
+        <w:t xml:space="preserve">plaintext </w:t>
+      </w:r>
+      <w:r>
+        <w:rPr>
+          <w:cs/>
+        </w:rPr>
+        <w:t xml:space="preserve">เกืนกว่า </w:t>
+      </w:r>
+      <w:r>
+        <w:t xml:space="preserve">15 </w:t>
+      </w:r>
+      <w:r>
+        <w:rPr>
+          <w:cs/>
+        </w:rPr>
+        <w:t xml:space="preserve">ตัวอักษรขึ้นไปเพื่อป้องกัน </w:t>
+      </w:r>
+      <w:r>
+        <w:t xml:space="preserve">brute force </w:t>
+      </w:r>
+      <w:r>
+        <w:rPr>
+          <w:cs/>
+        </w:rPr>
+        <w:t xml:space="preserve">อีกทั้งต้องมีการกำหนดให้ </w:t>
+      </w:r>
+      <w:r>
+        <w:t xml:space="preserve">password </w:t>
+      </w:r>
+      <w:r>
+        <w:rPr>
+          <w:cs/>
+        </w:rPr>
+        <w:t xml:space="preserve">มี </w:t>
+      </w:r>
+      <w:r>
+        <w:t xml:space="preserve">lower char, upper char, number, special char </w:t>
+      </w:r>
+      <w:r>
+        <w:rPr>
+          <w:cs/>
+        </w:rPr>
+        <w:t xml:space="preserve">ด้วยเพื่อป้องกัน </w:t>
+      </w:r>
+      <w:r>
+        <w:t>dict attack</w:t>
+      </w:r>
       <w:r>
         <w:t xml:space="preserve"> </w:t>
       </w:r>
       <w:r>
         <w:rPr>
-          <w:cs/>
-        </w:rPr>
-        <w:t xml:space="preserve">ที่ </w:t>
-      </w:r>
-      <w:r>
-        <w:t xml:space="preserve">gen salt </w:t>
-      </w:r>
-      <w:r>
-        <w:rPr>
-          <w:cs/>
-        </w:rPr>
-        <w:t>ด้วยข้อมูล</w:t>
-      </w:r>
-      <w:r>
-        <w:t xml:space="preserve"> algorithm random </w:t>
-      </w:r>
-      <w:r>
-        <w:rPr>
-          <w:cs/>
-        </w:rPr>
-        <w:t xml:space="preserve">เป็นต้น เพื่อป้องกัน </w:t>
-      </w:r>
-      <w:r>
-        <w:t xml:space="preserve">rainbow attack </w:t>
-      </w:r>
-      <w:r>
-        <w:rPr>
-          <w:cs/>
-        </w:rPr>
-        <w:t xml:space="preserve">และ </w:t>
-      </w:r>
-      <w:r>
-        <w:t xml:space="preserve">schema </w:t>
-      </w:r>
-      <w:r>
-        <w:rPr>
-          <w:cs/>
-        </w:rPr>
-        <w:t xml:space="preserve">ของ </w:t>
-      </w:r>
-      <w:r>
-        <w:t xml:space="preserve">database </w:t>
-      </w:r>
-      <w:r>
-        <w:rPr>
-          <w:cs/>
-        </w:rPr>
-        <w:t xml:space="preserve">ก็ต้องกำหนดให้ </w:t>
-      </w:r>
-      <w:r>
-        <w:t xml:space="preserve">password </w:t>
-      </w:r>
-      <w:r>
-        <w:rPr>
-          <w:cs/>
-        </w:rPr>
-        <w:t xml:space="preserve">มีความยาวของ </w:t>
-      </w:r>
-      <w:r>
-        <w:t xml:space="preserve">plaintext </w:t>
-      </w:r>
-      <w:r>
-        <w:rPr>
-          <w:cs/>
-        </w:rPr>
-        <w:t xml:space="preserve">เกืนกว่า </w:t>
-      </w:r>
-      <w:r>
-        <w:t xml:space="preserve">15 </w:t>
-      </w:r>
-      <w:r>
-        <w:rPr>
-          <w:cs/>
-        </w:rPr>
-        <w:t xml:space="preserve">ตัวอักษรขึ้นไปเพื่อป้องกัน </w:t>
-      </w:r>
-      <w:r>
-        <w:t xml:space="preserve">brute force </w:t>
-      </w:r>
-      <w:r>
-        <w:rPr>
-          <w:cs/>
-        </w:rPr>
-        <w:t xml:space="preserve">อีกทั้งต้องมีการกำหนดให้ </w:t>
-      </w:r>
-      <w:r>
-        <w:t xml:space="preserve">password </w:t>
-      </w:r>
-      <w:r>
-        <w:rPr>
-          <w:cs/>
-        </w:rPr>
-        <w:t xml:space="preserve">มี </w:t>
-      </w:r>
-      <w:r>
-        <w:t xml:space="preserve">lower char, upper char, number, special char </w:t>
-      </w:r>
-      <w:r>
-        <w:rPr>
-          <w:cs/>
-        </w:rPr>
-        <w:t xml:space="preserve">ด้วยเพื่อป้องกัน </w:t>
-      </w:r>
-      <w:proofErr w:type="spellStart"/>
-      <w:r>
-        <w:t>dict</w:t>
-      </w:r>
-      <w:proofErr w:type="spellEnd"/>
-      <w:r>
-        <w:t xml:space="preserve"> attack</w:t>
+          <w:rFonts w:hint="cs"/>
+          <w:cs/>
+        </w:rPr>
+        <w:t>โดยในมุมของ</w:t>
+      </w:r>
+      <w:r>
+        <w:t xml:space="preserve"> cost </w:t>
+      </w:r>
+      <w:r>
+        <w:rPr>
+          <w:rFonts w:hint="cs"/>
+          <w:cs/>
+        </w:rPr>
+        <w:t>มองในแง่ของ</w:t>
+      </w:r>
+      <w:r>
+        <w:t xml:space="preserve"> performance </w:t>
+      </w:r>
+      <w:r>
+        <w:rPr>
+          <w:rFonts w:hint="cs"/>
+          <w:cs/>
+        </w:rPr>
+        <w:t>โดยที่ถ้าเรากำหนดให้ การ</w:t>
+      </w:r>
+      <w:r>
+        <w:t xml:space="preserve"> process password </w:t>
+      </w:r>
+      <w:r>
+        <w:rPr>
+          <w:rFonts w:hint="cs"/>
+          <w:cs/>
+        </w:rPr>
+        <w:t>ด้วยระบบดังกล่าวใช้เวลาไม่เกิน</w:t>
+      </w:r>
+      <w:r>
+        <w:t xml:space="preserve"> 500ms</w:t>
+      </w:r>
+      <w:r>
+        <w:rPr>
+          <w:rFonts w:hint="cs"/>
+          <w:cs/>
+        </w:rPr>
+        <w:t xml:space="preserve"> โดยการปรับ</w:t>
+      </w:r>
+      <w:r>
+        <w:t xml:space="preserve"> cost factor</w:t>
       </w:r>
       <w:r>
         <w:t xml:space="preserve"> </w:t>
-      </w:r>
-      <w:r>
-        <w:rPr>
-          <w:rFonts w:hint="cs"/>
-          <w:cs/>
-        </w:rPr>
-        <w:t>โดยในมุมของ</w:t>
-      </w:r>
-      <w:r>
-        <w:t xml:space="preserve"> cost </w:t>
-      </w:r>
-      <w:r>
-        <w:rPr>
-          <w:rFonts w:hint="cs"/>
-          <w:cs/>
-        </w:rPr>
-        <w:t>มองในแง่ของ</w:t>
-      </w:r>
-      <w:r>
-        <w:t xml:space="preserve"> performance </w:t>
-      </w:r>
-      <w:r>
-        <w:rPr>
-          <w:rFonts w:hint="cs"/>
-          <w:cs/>
-        </w:rPr>
-        <w:t>โดยที่ถ้าเรากำหนดให้ การ</w:t>
-      </w:r>
-      <w:r>
-        <w:t xml:space="preserve"> process password </w:t>
-      </w:r>
-      <w:r>
-        <w:rPr>
-          <w:rFonts w:hint="cs"/>
-          <w:cs/>
-        </w:rPr>
-        <w:t>ด้วยระบบดังกล่าวใช้เวลาไม่เกิน</w:t>
-      </w:r>
-      <w:r>
-        <w:t xml:space="preserve"> 500ms </w:t>
       </w:r>
       <w:r>
         <w:rPr>

</xml_diff>